<commit_message>
TMGH: re-issue 17-06 study with three-lens fundamental (SOTP/RNAV primary, run-off DCF cross-check, NAV-discount); self-liquidating inventory; refresh PDF/XLSX/DOCX; bump cache-buster
</commit_message>
<xml_diff>
--- a/files/TMGH_Valuation_Study_17-06-2026_public.docx
+++ b/files/TMGH_Valuation_Study_17-06-2026_public.docx
@@ -321,7 +321,45 @@
         <w:rPr>
           <w:rFonts w:ascii="Arial" w:cs="Arial" w:eastAsia="Arial" w:hAnsi="Arial"/>
         </w:rPr>
-        <w:t xml:space="preserve"> is valued — already-sold units sit in the contracted backlog, so nothing is double-counted. Each cohort carries an EGP price escalator (~14%/yr) and is collected over a down-payment-plus-instalment schedule; a 5% perpetual-growth (Gordon) terminal value captures development beyond the disclosed pipeline. Construction is paced to TMGH’s actual run-rate, so consolidated free cash flow is positive throughout. Full mechanics and every input are in the companion Excel model.</w:t>
+        <w:t xml:space="preserve"> is valued — already-sold units sit in the contracted backlog, so nothing is double-counted. Each cohort carries an EGP price escalator (~14%/yr) and is collected over a down-payment-plus-instalment schedule. Crucially, each development is valued as a self-liquidating run-off — the cash flows run only to completion of the disclosed pipeline, with no perpetual-growth (Gordon) terminal value bolted onto a finite land bank, because a developer is a depleting pool of projects, not a going concern with a stable perpetuity. Construction is paced to TMGH’s actual run-rate, so consolidated free cash flow is positive throughout and the consolidated land-and-WIP inventory self-liquidates from book rather than running negative. Full mechanics and every input are in the companion Excel model.</w:t>
+      </w:r>
+    </w:p>
+    <w:p>
+      <w:pPr>
+        <w:spacing w:after="120" w:line="264"/>
+      </w:pPr>
+      <w:r>
+        <w:rPr>
+          <w:rFonts w:ascii="Arial" w:cs="Arial" w:eastAsia="Arial" w:hAnsi="Arial"/>
+          <w:b/>
+          <w:bCs/>
+        </w:rPr>
+        <w:t xml:space="preserve">The standing method, and the global standard. </w:t>
+      </w:r>
+      <w:r>
+        <w:rPr>
+          <w:rFonts w:ascii="Arial" w:cs="Arial" w:eastAsia="Arial" w:hAnsi="Arial"/>
+        </w:rPr>
+        <w:t xml:space="preserve">For a listed property developer, the primary valuation method used across global and regional investment banks is a revalued net-asset value (RNAV) built as a sum-of-the-parts: each development is valued by a discounted cash flow of its own project economics; recurring and hospitality income are capitalised on multiples; and a discount to gross NAV is then applied to reach a target price. A whole-company DCF is a cross-check, not the primary lens — and for a developer it must be a self-liquidating run-off, because bolting a perpetual-growth terminal value onto a finite, depleting land bank double-counts. This study reports all three lenses side by side and then selects a representative figure.</w:t>
+      </w:r>
+    </w:p>
+    <w:p>
+      <w:pPr>
+        <w:spacing w:after="120" w:line="264"/>
+      </w:pPr>
+      <w:r>
+        <w:rPr>
+          <w:rFonts w:ascii="Arial" w:cs="Arial" w:eastAsia="Arial" w:hAnsi="Arial"/>
+          <w:b/>
+          <w:bCs/>
+        </w:rPr>
+        <w:t xml:space="preserve">The three lenses. </w:t>
+      </w:r>
+      <w:r>
+        <w:rPr>
+          <w:rFonts w:ascii="Arial" w:cs="Arial" w:eastAsia="Arial" w:hAnsi="Arial"/>
+        </w:rPr>
+        <w:t xml:space="preserve">The primary lens (A) is the execution-weighted SOTP/RNAV. The consolidated run-off DCF (B) is the cross-check: with the perpetuity removed it ties to the SOTP gross, confirming the asset value rather than adding to it. The NAV-less-discount lens (C) is the street-style basis used to set a target price, and relative multiples are a memo sanity check.</w:t>
       </w:r>
     </w:p>
     <w:tbl>
@@ -376,6 +414,665 @@
                 <w:sz w:val="16"/>
                 <w:szCs w:val="16"/>
               </w:rPr>
+              <w:t xml:space="preserve">Lens</w:t>
+            </w:r>
+          </w:p>
+        </w:tc>
+        <w:tc>
+          <w:tcPr>
+            <w:tcW w:type="dxa" w:w="1500"/>
+            <w:tcBorders>
+              <w:top w:val="single" w:color="BFD4D4" w:sz="1"/>
+              <w:left w:val="single" w:color="BFD4D4" w:sz="1"/>
+              <w:bottom w:val="single" w:color="BFD4D4" w:sz="1"/>
+              <w:right w:val="single" w:color="BFD4D4" w:sz="1"/>
+            </w:tcBorders>
+            <w:shd w:fill="1B5E5E" w:val="clear"/>
+            <w:tcMar>
+              <w:top w:type="dxa" w:w="55"/>
+              <w:left w:type="dxa" w:w="100"/>
+              <w:bottom w:type="dxa" w:w="55"/>
+              <w:right w:type="dxa" w:w="100"/>
+            </w:tcMar>
+            <w:vAlign w:val="center"/>
+          </w:tcPr>
+          <w:p>
+            <w:pPr>
+              <w:jc w:val="left"/>
+            </w:pPr>
+            <w:r>
+              <w:rPr>
+                <w:rFonts w:ascii="Arial" w:cs="Arial" w:eastAsia="Arial" w:hAnsi="Arial"/>
+                <w:b/>
+                <w:bCs/>
+                <w:color w:val="FFFFFF"/>
+                <w:sz w:val="16"/>
+                <w:szCs w:val="16"/>
+              </w:rPr>
+              <w:t xml:space="preserve">EGP / share</w:t>
+            </w:r>
+          </w:p>
+        </w:tc>
+        <w:tc>
+          <w:tcPr>
+            <w:tcW w:type="dxa" w:w="4800"/>
+            <w:tcBorders>
+              <w:top w:val="single" w:color="BFD4D4" w:sz="1"/>
+              <w:left w:val="single" w:color="BFD4D4" w:sz="1"/>
+              <w:bottom w:val="single" w:color="BFD4D4" w:sz="1"/>
+              <w:right w:val="single" w:color="BFD4D4" w:sz="1"/>
+            </w:tcBorders>
+            <w:shd w:fill="1B5E5E" w:val="clear"/>
+            <w:tcMar>
+              <w:top w:type="dxa" w:w="55"/>
+              <w:left w:type="dxa" w:w="100"/>
+              <w:bottom w:type="dxa" w:w="55"/>
+              <w:right w:type="dxa" w:w="100"/>
+            </w:tcMar>
+            <w:vAlign w:val="center"/>
+          </w:tcPr>
+          <w:p>
+            <w:pPr>
+              <w:jc w:val="left"/>
+            </w:pPr>
+            <w:r>
+              <w:rPr>
+                <w:rFonts w:ascii="Arial" w:cs="Arial" w:eastAsia="Arial" w:hAnsi="Arial"/>
+                <w:b/>
+                <w:bCs/>
+                <w:color w:val="FFFFFF"/>
+                <w:sz w:val="16"/>
+                <w:szCs w:val="16"/>
+              </w:rPr>
+              <w:t xml:space="preserve">Basis — and how it is computed</w:t>
+            </w:r>
+          </w:p>
+        </w:tc>
+      </w:tr>
+      <w:tr>
+        <w:tc>
+          <w:tcPr>
+            <w:tcW w:type="dxa" w:w="3060"/>
+            <w:tcBorders>
+              <w:top w:val="single" w:color="BFD4D4" w:sz="1"/>
+              <w:left w:val="single" w:color="BFD4D4" w:sz="1"/>
+              <w:bottom w:val="single" w:color="BFD4D4" w:sz="1"/>
+              <w:right w:val="single" w:color="BFD4D4" w:sz="1"/>
+            </w:tcBorders>
+            <w:tcMar>
+              <w:top w:type="dxa" w:w="55"/>
+              <w:left w:type="dxa" w:w="100"/>
+              <w:bottom w:type="dxa" w:w="55"/>
+              <w:right w:type="dxa" w:w="100"/>
+            </w:tcMar>
+            <w:vAlign w:val="center"/>
+          </w:tcPr>
+          <w:p>
+            <w:pPr>
+              <w:jc w:val="left"/>
+            </w:pPr>
+            <w:r>
+              <w:rPr>
+                <w:rFonts w:ascii="Arial" w:cs="Arial" w:eastAsia="Arial" w:hAnsi="Arial"/>
+                <w:b/>
+                <w:bCs/>
+                <w:color w:val="1B1B1B"/>
+                <w:sz w:val="16"/>
+                <w:szCs w:val="16"/>
+              </w:rPr>
+              <w:t xml:space="preserve">A. SOTP / RNAV — PRIMARY</w:t>
+            </w:r>
+          </w:p>
+        </w:tc>
+        <w:tc>
+          <w:tcPr>
+            <w:tcW w:type="dxa" w:w="1500"/>
+            <w:tcBorders>
+              <w:top w:val="single" w:color="BFD4D4" w:sz="1"/>
+              <w:left w:val="single" w:color="BFD4D4" w:sz="1"/>
+              <w:bottom w:val="single" w:color="BFD4D4" w:sz="1"/>
+              <w:right w:val="single" w:color="BFD4D4" w:sz="1"/>
+            </w:tcBorders>
+            <w:tcMar>
+              <w:top w:type="dxa" w:w="55"/>
+              <w:left w:type="dxa" w:w="100"/>
+              <w:bottom w:type="dxa" w:w="55"/>
+              <w:right w:type="dxa" w:w="100"/>
+            </w:tcMar>
+            <w:vAlign w:val="center"/>
+          </w:tcPr>
+          <w:p>
+            <w:pPr>
+              <w:jc w:val="left"/>
+            </w:pPr>
+            <w:r>
+              <w:rPr>
+                <w:rFonts w:ascii="Arial" w:cs="Arial" w:eastAsia="Arial" w:hAnsi="Arial"/>
+                <w:b/>
+                <w:bCs/>
+                <w:color w:val="1B1B1B"/>
+                <w:sz w:val="16"/>
+                <w:szCs w:val="16"/>
+              </w:rPr>
+              <w:t xml:space="preserve">147.1</w:t>
+            </w:r>
+          </w:p>
+        </w:tc>
+        <w:tc>
+          <w:tcPr>
+            <w:tcW w:type="dxa" w:w="4800"/>
+            <w:tcBorders>
+              <w:top w:val="single" w:color="BFD4D4" w:sz="1"/>
+              <w:left w:val="single" w:color="BFD4D4" w:sz="1"/>
+              <w:bottom w:val="single" w:color="BFD4D4" w:sz="1"/>
+              <w:right w:val="single" w:color="BFD4D4" w:sz="1"/>
+            </w:tcBorders>
+            <w:tcMar>
+              <w:top w:type="dxa" w:w="55"/>
+              <w:left w:type="dxa" w:w="100"/>
+              <w:bottom w:type="dxa" w:w="55"/>
+              <w:right w:type="dxa" w:w="100"/>
+            </w:tcMar>
+            <w:vAlign w:val="center"/>
+          </w:tcPr>
+          <w:p>
+            <w:pPr>
+              <w:jc w:val="left"/>
+            </w:pPr>
+            <w:r>
+              <w:rPr>
+                <w:rFonts w:ascii="Arial" w:cs="Arial" w:eastAsia="Arial" w:hAnsi="Arial"/>
+                <w:color w:val="1B1B1B"/>
+                <w:sz w:val="16"/>
+                <w:szCs w:val="16"/>
+              </w:rPr>
+              <w:t xml:space="preserve">Per-project DCF (unsold remainder) + hospitality and recurring segments on EBITDA multiples + net cash (90% parent) − segment minority. Risk-adjusted (execution-weighted) central; 189.6 gross at full execution; 83.6 bear. The primary method for a diversified developer.</w:t>
+            </w:r>
+          </w:p>
+        </w:tc>
+      </w:tr>
+      <w:tr>
+        <w:tc>
+          <w:tcPr>
+            <w:tcW w:type="dxa" w:w="3060"/>
+            <w:tcBorders>
+              <w:top w:val="single" w:color="BFD4D4" w:sz="1"/>
+              <w:left w:val="single" w:color="BFD4D4" w:sz="1"/>
+              <w:bottom w:val="single" w:color="BFD4D4" w:sz="1"/>
+              <w:right w:val="single" w:color="BFD4D4" w:sz="1"/>
+            </w:tcBorders>
+            <w:tcMar>
+              <w:top w:type="dxa" w:w="55"/>
+              <w:left w:type="dxa" w:w="100"/>
+              <w:bottom w:type="dxa" w:w="55"/>
+              <w:right w:type="dxa" w:w="100"/>
+            </w:tcMar>
+            <w:vAlign w:val="center"/>
+          </w:tcPr>
+          <w:p>
+            <w:pPr>
+              <w:jc w:val="left"/>
+            </w:pPr>
+            <w:r>
+              <w:rPr>
+                <w:rFonts w:ascii="Arial" w:cs="Arial" w:eastAsia="Arial" w:hAnsi="Arial"/>
+                <w:b/>
+                <w:bCs/>
+                <w:color w:val="1B1B1B"/>
+                <w:sz w:val="16"/>
+                <w:szCs w:val="16"/>
+              </w:rPr>
+              <w:t xml:space="preserve">B. Consolidated run-off DCF — cross-check</w:t>
+            </w:r>
+          </w:p>
+        </w:tc>
+        <w:tc>
+          <w:tcPr>
+            <w:tcW w:type="dxa" w:w="1500"/>
+            <w:tcBorders>
+              <w:top w:val="single" w:color="BFD4D4" w:sz="1"/>
+              <w:left w:val="single" w:color="BFD4D4" w:sz="1"/>
+              <w:bottom w:val="single" w:color="BFD4D4" w:sz="1"/>
+              <w:right w:val="single" w:color="BFD4D4" w:sz="1"/>
+            </w:tcBorders>
+            <w:tcMar>
+              <w:top w:type="dxa" w:w="55"/>
+              <w:left w:type="dxa" w:w="100"/>
+              <w:bottom w:type="dxa" w:w="55"/>
+              <w:right w:type="dxa" w:w="100"/>
+            </w:tcMar>
+            <w:vAlign w:val="center"/>
+          </w:tcPr>
+          <w:p>
+            <w:pPr>
+              <w:jc w:val="left"/>
+            </w:pPr>
+            <w:r>
+              <w:rPr>
+                <w:rFonts w:ascii="Arial" w:cs="Arial" w:eastAsia="Arial" w:hAnsi="Arial"/>
+                <w:b/>
+                <w:bCs/>
+                <w:color w:val="1B1B1B"/>
+                <w:sz w:val="16"/>
+                <w:szCs w:val="16"/>
+              </w:rPr>
+              <w:t xml:space="preserve">196.5</w:t>
+            </w:r>
+          </w:p>
+        </w:tc>
+        <w:tc>
+          <w:tcPr>
+            <w:tcW w:type="dxa" w:w="4800"/>
+            <w:tcBorders>
+              <w:top w:val="single" w:color="BFD4D4" w:sz="1"/>
+              <w:left w:val="single" w:color="BFD4D4" w:sz="1"/>
+              <w:bottom w:val="single" w:color="BFD4D4" w:sz="1"/>
+              <w:right w:val="single" w:color="BFD4D4" w:sz="1"/>
+            </w:tcBorders>
+            <w:tcMar>
+              <w:top w:type="dxa" w:w="55"/>
+              <w:left w:type="dxa" w:w="100"/>
+              <w:bottom w:type="dxa" w:w="55"/>
+              <w:right w:type="dxa" w:w="100"/>
+            </w:tcMar>
+            <w:vAlign w:val="center"/>
+          </w:tcPr>
+          <w:p>
+            <w:pPr>
+              <w:jc w:val="left"/>
+            </w:pPr>
+            <w:r>
+              <w:rPr>
+                <w:rFonts w:ascii="Arial" w:cs="Arial" w:eastAsia="Arial" w:hAnsi="Arial"/>
+                <w:color w:val="1B1B1B"/>
+                <w:sz w:val="16"/>
+                <w:szCs w:val="16"/>
+              </w:rPr>
+              <w:t xml:space="preserve">Whole-company unlevered FCFF discounted at WACC, self-liquidating, with NO perpetual-growth terminal value. Ties to the SOTP gross (189.6), validating the primary method rather than adding to it.</w:t>
+            </w:r>
+          </w:p>
+        </w:tc>
+      </w:tr>
+      <w:tr>
+        <w:tc>
+          <w:tcPr>
+            <w:tcW w:type="dxa" w:w="3060"/>
+            <w:tcBorders>
+              <w:top w:val="single" w:color="BFD4D4" w:sz="1"/>
+              <w:left w:val="single" w:color="BFD4D4" w:sz="1"/>
+              <w:bottom w:val="single" w:color="BFD4D4" w:sz="1"/>
+              <w:right w:val="single" w:color="BFD4D4" w:sz="1"/>
+            </w:tcBorders>
+            <w:tcMar>
+              <w:top w:type="dxa" w:w="55"/>
+              <w:left w:type="dxa" w:w="100"/>
+              <w:bottom w:type="dxa" w:w="55"/>
+              <w:right w:type="dxa" w:w="100"/>
+            </w:tcMar>
+            <w:vAlign w:val="center"/>
+          </w:tcPr>
+          <w:p>
+            <w:pPr>
+              <w:jc w:val="left"/>
+            </w:pPr>
+            <w:r>
+              <w:rPr>
+                <w:rFonts w:ascii="Arial" w:cs="Arial" w:eastAsia="Arial" w:hAnsi="Arial"/>
+                <w:b/>
+                <w:bCs/>
+                <w:color w:val="1B1B1B"/>
+                <w:sz w:val="16"/>
+                <w:szCs w:val="16"/>
+              </w:rPr>
+              <w:t xml:space="preserve">C. NAV less holding-company discount — street-style</w:t>
+            </w:r>
+          </w:p>
+        </w:tc>
+        <w:tc>
+          <w:tcPr>
+            <w:tcW w:type="dxa" w:w="1500"/>
+            <w:tcBorders>
+              <w:top w:val="single" w:color="BFD4D4" w:sz="1"/>
+              <w:left w:val="single" w:color="BFD4D4" w:sz="1"/>
+              <w:bottom w:val="single" w:color="BFD4D4" w:sz="1"/>
+              <w:right w:val="single" w:color="BFD4D4" w:sz="1"/>
+            </w:tcBorders>
+            <w:tcMar>
+              <w:top w:type="dxa" w:w="55"/>
+              <w:left w:type="dxa" w:w="100"/>
+              <w:bottom w:type="dxa" w:w="55"/>
+              <w:right w:type="dxa" w:w="100"/>
+            </w:tcMar>
+            <w:vAlign w:val="center"/>
+          </w:tcPr>
+          <w:p>
+            <w:pPr>
+              <w:jc w:val="left"/>
+            </w:pPr>
+            <w:r>
+              <w:rPr>
+                <w:rFonts w:ascii="Arial" w:cs="Arial" w:eastAsia="Arial" w:hAnsi="Arial"/>
+                <w:b/>
+                <w:bCs/>
+                <w:color w:val="1B1B1B"/>
+                <w:sz w:val="16"/>
+                <w:szCs w:val="16"/>
+              </w:rPr>
+              <w:t xml:space="preserve">113.7 / 104.3</w:t>
+            </w:r>
+          </w:p>
+        </w:tc>
+        <w:tc>
+          <w:tcPr>
+            <w:tcW w:type="dxa" w:w="4800"/>
+            <w:tcBorders>
+              <w:top w:val="single" w:color="BFD4D4" w:sz="1"/>
+              <w:left w:val="single" w:color="BFD4D4" w:sz="1"/>
+              <w:bottom w:val="single" w:color="BFD4D4" w:sz="1"/>
+              <w:right w:val="single" w:color="BFD4D4" w:sz="1"/>
+            </w:tcBorders>
+            <w:tcMar>
+              <w:top w:type="dxa" w:w="55"/>
+              <w:left w:type="dxa" w:w="100"/>
+              <w:bottom w:type="dxa" w:w="55"/>
+              <w:right w:type="dxa" w:w="100"/>
+            </w:tcMar>
+            <w:vAlign w:val="center"/>
+          </w:tcPr>
+          <w:p>
+            <w:pPr>
+              <w:jc w:val="left"/>
+            </w:pPr>
+            <w:r>
+              <w:rPr>
+                <w:rFonts w:ascii="Arial" w:cs="Arial" w:eastAsia="Arial" w:hAnsi="Arial"/>
+                <w:color w:val="1B1B1B"/>
+                <w:sz w:val="16"/>
+                <w:szCs w:val="16"/>
+              </w:rPr>
+              <w:t xml:space="preserve">Gross NAV (189.6) × (1 − discount): 40% (current street) and 45% (7-yr average). The basis on which a published target price is set; brackets the conservative side.</w:t>
+            </w:r>
+          </w:p>
+        </w:tc>
+      </w:tr>
+      <w:tr>
+        <w:tc>
+          <w:tcPr>
+            <w:tcW w:type="dxa" w:w="3060"/>
+            <w:tcBorders>
+              <w:top w:val="single" w:color="BFD4D4" w:sz="1"/>
+              <w:left w:val="single" w:color="BFD4D4" w:sz="1"/>
+              <w:bottom w:val="single" w:color="BFD4D4" w:sz="1"/>
+              <w:right w:val="single" w:color="BFD4D4" w:sz="1"/>
+            </w:tcBorders>
+            <w:tcMar>
+              <w:top w:type="dxa" w:w="55"/>
+              <w:left w:type="dxa" w:w="100"/>
+              <w:bottom w:type="dxa" w:w="55"/>
+              <w:right w:type="dxa" w:w="100"/>
+            </w:tcMar>
+            <w:vAlign w:val="center"/>
+          </w:tcPr>
+          <w:p>
+            <w:pPr>
+              <w:jc w:val="left"/>
+            </w:pPr>
+            <w:r>
+              <w:rPr>
+                <w:rFonts w:ascii="Arial" w:cs="Arial" w:eastAsia="Arial" w:hAnsi="Arial"/>
+                <w:b/>
+                <w:bCs/>
+                <w:color w:val="1B1B1B"/>
+                <w:sz w:val="16"/>
+                <w:szCs w:val="16"/>
+              </w:rPr>
+              <w:t xml:space="preserve">Relative multiples — memo</w:t>
+            </w:r>
+          </w:p>
+        </w:tc>
+        <w:tc>
+          <w:tcPr>
+            <w:tcW w:type="dxa" w:w="1500"/>
+            <w:tcBorders>
+              <w:top w:val="single" w:color="BFD4D4" w:sz="1"/>
+              <w:left w:val="single" w:color="BFD4D4" w:sz="1"/>
+              <w:bottom w:val="single" w:color="BFD4D4" w:sz="1"/>
+              <w:right w:val="single" w:color="BFD4D4" w:sz="1"/>
+            </w:tcBorders>
+            <w:tcMar>
+              <w:top w:type="dxa" w:w="55"/>
+              <w:left w:type="dxa" w:w="100"/>
+              <w:bottom w:type="dxa" w:w="55"/>
+              <w:right w:type="dxa" w:w="100"/>
+            </w:tcMar>
+            <w:vAlign w:val="center"/>
+          </w:tcPr>
+          <w:p>
+            <w:pPr>
+              <w:jc w:val="left"/>
+            </w:pPr>
+            <w:r>
+              <w:rPr>
+                <w:rFonts w:ascii="Arial" w:cs="Arial" w:eastAsia="Arial" w:hAnsi="Arial"/>
+                <w:b/>
+                <w:bCs/>
+                <w:color w:val="1B1B1B"/>
+                <w:sz w:val="16"/>
+                <w:szCs w:val="16"/>
+              </w:rPr>
+              <w:t xml:space="preserve">—</w:t>
+            </w:r>
+          </w:p>
+        </w:tc>
+        <w:tc>
+          <w:tcPr>
+            <w:tcW w:type="dxa" w:w="4800"/>
+            <w:tcBorders>
+              <w:top w:val="single" w:color="BFD4D4" w:sz="1"/>
+              <w:left w:val="single" w:color="BFD4D4" w:sz="1"/>
+              <w:bottom w:val="single" w:color="BFD4D4" w:sz="1"/>
+              <w:right w:val="single" w:color="BFD4D4" w:sz="1"/>
+            </w:tcBorders>
+            <w:tcMar>
+              <w:top w:type="dxa" w:w="55"/>
+              <w:left w:type="dxa" w:w="100"/>
+              <w:bottom w:type="dxa" w:w="55"/>
+              <w:right w:type="dxa" w:w="100"/>
+            </w:tcMar>
+            <w:vAlign w:val="center"/>
+          </w:tcPr>
+          <w:p>
+            <w:pPr>
+              <w:jc w:val="left"/>
+            </w:pPr>
+            <w:r>
+              <w:rPr>
+                <w:rFonts w:ascii="Arial" w:cs="Arial" w:eastAsia="Arial" w:hAnsi="Arial"/>
+                <w:color w:val="1B1B1B"/>
+                <w:sz w:val="16"/>
+                <w:szCs w:val="16"/>
+              </w:rPr>
+              <w:t xml:space="preserve">P/E ~13.9× trailing on attributable profit (developer peers ~6.4×); EV/backlog ~0.28× on the EGP 458bn book. Sanity checks, not a primary value.</w:t>
+            </w:r>
+          </w:p>
+        </w:tc>
+      </w:tr>
+      <w:tr>
+        <w:tc>
+          <w:tcPr>
+            <w:tcW w:type="dxa" w:w="3060"/>
+            <w:tcBorders>
+              <w:top w:val="single" w:color="BFD4D4" w:sz="1"/>
+              <w:left w:val="single" w:color="BFD4D4" w:sz="1"/>
+              <w:bottom w:val="single" w:color="BFD4D4" w:sz="1"/>
+              <w:right w:val="single" w:color="BFD4D4" w:sz="1"/>
+            </w:tcBorders>
+            <w:tcMar>
+              <w:top w:type="dxa" w:w="55"/>
+              <w:left w:type="dxa" w:w="100"/>
+              <w:bottom w:type="dxa" w:w="55"/>
+              <w:right w:type="dxa" w:w="100"/>
+            </w:tcMar>
+            <w:vAlign w:val="center"/>
+          </w:tcPr>
+          <w:p>
+            <w:pPr>
+              <w:jc w:val="left"/>
+            </w:pPr>
+            <w:r>
+              <w:rPr>
+                <w:rFonts w:ascii="Arial" w:cs="Arial" w:eastAsia="Arial" w:hAnsi="Arial"/>
+                <w:b/>
+                <w:bCs/>
+                <w:color w:val="1B1B1B"/>
+                <w:sz w:val="16"/>
+                <w:szCs w:val="16"/>
+              </w:rPr>
+              <w:t xml:space="preserve">REPRESENTATIVE FUNDAMENTAL VALUE</w:t>
+            </w:r>
+          </w:p>
+        </w:tc>
+        <w:tc>
+          <w:tcPr>
+            <w:tcW w:type="dxa" w:w="1500"/>
+            <w:tcBorders>
+              <w:top w:val="single" w:color="BFD4D4" w:sz="1"/>
+              <w:left w:val="single" w:color="BFD4D4" w:sz="1"/>
+              <w:bottom w:val="single" w:color="BFD4D4" w:sz="1"/>
+              <w:right w:val="single" w:color="BFD4D4" w:sz="1"/>
+            </w:tcBorders>
+            <w:tcMar>
+              <w:top w:type="dxa" w:w="55"/>
+              <w:left w:type="dxa" w:w="100"/>
+              <w:bottom w:type="dxa" w:w="55"/>
+              <w:right w:type="dxa" w:w="100"/>
+            </w:tcMar>
+            <w:vAlign w:val="center"/>
+          </w:tcPr>
+          <w:p>
+            <w:pPr>
+              <w:jc w:val="left"/>
+            </w:pPr>
+            <w:r>
+              <w:rPr>
+                <w:rFonts w:ascii="Arial" w:cs="Arial" w:eastAsia="Arial" w:hAnsi="Arial"/>
+                <w:b/>
+                <w:bCs/>
+                <w:color w:val="1B1B1B"/>
+                <w:sz w:val="16"/>
+                <w:szCs w:val="16"/>
+              </w:rPr>
+              <w:t xml:space="preserve">147.1</w:t>
+            </w:r>
+          </w:p>
+        </w:tc>
+        <w:tc>
+          <w:tcPr>
+            <w:tcW w:type="dxa" w:w="4800"/>
+            <w:tcBorders>
+              <w:top w:val="single" w:color="BFD4D4" w:sz="1"/>
+              <w:left w:val="single" w:color="BFD4D4" w:sz="1"/>
+              <w:bottom w:val="single" w:color="BFD4D4" w:sz="1"/>
+              <w:right w:val="single" w:color="BFD4D4" w:sz="1"/>
+            </w:tcBorders>
+            <w:tcMar>
+              <w:top w:type="dxa" w:w="55"/>
+              <w:left w:type="dxa" w:w="100"/>
+              <w:bottom w:type="dxa" w:w="55"/>
+              <w:right w:type="dxa" w:w="100"/>
+            </w:tcMar>
+            <w:vAlign w:val="center"/>
+          </w:tcPr>
+          <w:p>
+            <w:pPr>
+              <w:jc w:val="left"/>
+            </w:pPr>
+            <w:r>
+              <w:rPr>
+                <w:rFonts w:ascii="Arial" w:cs="Arial" w:eastAsia="Arial" w:hAnsi="Arial"/>
+                <w:b/>
+                <w:bCs/>
+                <w:color w:val="1B1B1B"/>
+                <w:sz w:val="16"/>
+                <w:szCs w:val="16"/>
+              </w:rPr>
+              <w:t xml:space="preserve">Execution-weighted SOTP/RNAV (the primary lens). Full fundamental range across lenses ~104–197; bear floor ~83.6; gross ceiling 189.6.</w:t>
+            </w:r>
+          </w:p>
+        </w:tc>
+      </w:tr>
+    </w:tbl>
+    <w:p>
+      <w:pPr>
+        <w:spacing w:after="120" w:line="264"/>
+      </w:pPr>
+      <w:r>
+        <w:rPr>
+          <w:rFonts w:ascii="Arial" w:cs="Arial" w:eastAsia="Arial" w:hAnsi="Arial"/>
+          <w:b/>
+          <w:bCs/>
+        </w:rPr>
+        <w:t xml:space="preserve">Selecting the representative fundamental value. </w:t>
+      </w:r>
+      <w:r>
+        <w:rPr>
+          <w:rFonts w:ascii="Arial" w:cs="Arial" w:eastAsia="Arial" w:hAnsi="Arial"/>
+        </w:rPr>
+        <w:t xml:space="preserve">Following the global standard for a diversified developer, this study anchors on the execution-weighted SOTP/RNAV — EGP 147.1 — as its representative fundamental value. The consolidated run-off DCF (EGP 196.5) confirms the gross NAV; the NAV-less-discount lens (EGP 104–114) and relative multiples bracket the conservative side; and the bear construction (EGP ~83.6) marks the floor. The full fundamental range is therefore ~EGP 104–197, with a gross (full-execution) ceiling of 189.6. No further blanket holding-company discount is layered on top of the execution-weighting, which already performs the risk adjustment; applying both would double-count.</w:t>
+      </w:r>
+    </w:p>
+    <w:tbl>
+      <w:tblPr>
+        <w:tblW w:type="dxa" w:w="9360"/>
+        <w:tblBorders>
+          <w:top w:val="single" w:color="auto" w:sz="4"/>
+          <w:left w:val="single" w:color="auto" w:sz="4"/>
+          <w:bottom w:val="single" w:color="auto" w:sz="4"/>
+          <w:right w:val="single" w:color="auto" w:sz="4"/>
+          <w:insideH w:val="single" w:color="auto" w:sz="4"/>
+          <w:insideV w:val="single" w:color="auto" w:sz="4"/>
+        </w:tblBorders>
+      </w:tblPr>
+      <w:tblGrid>
+        <w:gridCol w:w="3060"/>
+        <w:gridCol w:w="1500"/>
+        <w:gridCol w:w="4800"/>
+      </w:tblGrid>
+      <w:tr>
+        <w:trPr>
+          <w:tblHeader/>
+        </w:trPr>
+        <w:tc>
+          <w:tcPr>
+            <w:tcW w:type="dxa" w:w="3060"/>
+            <w:tcBorders>
+              <w:top w:val="single" w:color="BFD4D4" w:sz="1"/>
+              <w:left w:val="single" w:color="BFD4D4" w:sz="1"/>
+              <w:bottom w:val="single" w:color="BFD4D4" w:sz="1"/>
+              <w:right w:val="single" w:color="BFD4D4" w:sz="1"/>
+            </w:tcBorders>
+            <w:shd w:fill="1B5E5E" w:val="clear"/>
+            <w:tcMar>
+              <w:top w:type="dxa" w:w="55"/>
+              <w:left w:type="dxa" w:w="100"/>
+              <w:bottom w:type="dxa" w:w="55"/>
+              <w:right w:type="dxa" w:w="100"/>
+            </w:tcMar>
+            <w:vAlign w:val="center"/>
+          </w:tcPr>
+          <w:p>
+            <w:pPr>
+              <w:jc w:val="left"/>
+            </w:pPr>
+            <w:r>
+              <w:rPr>
+                <w:rFonts w:ascii="Arial" w:cs="Arial" w:eastAsia="Arial" w:hAnsi="Arial"/>
+                <w:b/>
+                <w:bCs/>
+                <w:color w:val="FFFFFF"/>
+                <w:sz w:val="16"/>
+                <w:szCs w:val="16"/>
+              </w:rPr>
               <w:t xml:space="preserve">Component (bottom-up build)</w:t>
             </w:r>
           </w:p>
@@ -1436,7 +2133,7 @@
                 <w:sz w:val="16"/>
                 <w:szCs w:val="16"/>
               </w:rPr>
-              <w:t xml:space="preserve">undeveloped land + going-concern terminal value</w:t>
+              <w:t xml:space="preserve">undeveloped land + a modest residual for the platform beyond the disclosed pipeline</w:t>
             </w:r>
           </w:p>
         </w:tc>

</xml_diff>